<commit_message>
feat: complete group registration and topic safeguards
</commit_message>
<xml_diff>
--- a/BaoCao_DoAn.docx
+++ b/BaoCao_DoAn.docx
@@ -3724,63 +3724,11 @@
           <w14:ligatures w14:val="standardContextual"/>
         </w:rPr>
       </w:pPr>
-      <w:hyperlink w:anchor="_Toc241154901" w:history="1">
-        <w:r>
-          <w:rPr>
-            <w:rStyle w:val="Hyperlink"/>
-            <w:noProof/>
-          </w:rPr>
-          <w:t>4.5 Quản lý phiên bản schema</w:t>
-        </w:r>
-        <w:r>
-          <w:rPr>
-            <w:noProof/>
-            <w:webHidden/>
-          </w:rPr>
-          <w:tab/>
-        </w:r>
-        <w:r>
-          <w:rPr>
-            <w:noProof/>
-            <w:webHidden/>
-          </w:rPr>
-          <w:fldChar w:fldCharType="begin"/>
-        </w:r>
-        <w:r>
-          <w:rPr>
-            <w:noProof/>
-            <w:webHidden/>
-          </w:rPr>
-          <w:instrText xml:space="preserve"> PAGEREF _Toc241154901 \h </w:instrText>
-        </w:r>
-        <w:r>
-          <w:rPr>
-            <w:noProof/>
-            <w:webHidden/>
-          </w:rPr>
-        </w:r>
-        <w:r>
-          <w:rPr>
-            <w:noProof/>
-            <w:webHidden/>
-          </w:rPr>
-          <w:fldChar w:fldCharType="separate"/>
-        </w:r>
-        <w:r>
-          <w:rPr>
-            <w:noProof/>
-            <w:webHidden/>
-          </w:rPr>
-          <w:t>23</w:t>
-        </w:r>
-        <w:r>
-          <w:rPr>
-            <w:noProof/>
-            <w:webHidden/>
-          </w:rPr>
-          <w:fldChar w:fldCharType="end"/>
-        </w:r>
-      </w:hyperlink>
+      <w:r>
+        <w:t>4.5 Quản lý schema bằng JPA/Hibernate</w:t>
+        <w:tab/>
+        <w:t>23</w:t>
+      </w:r>
     </w:p>
     <w:p>
       <w:pPr>
@@ -6707,7 +6655,7 @@
           <w:rFonts w:ascii="Times New Roman" w:eastAsia="Times New Roman" w:hAnsi="Times New Roman"/>
         </w:rPr>
         <w:br/>
-        <w:t xml:space="preserve">    TN-&gt;&gt;Sys: 5. Thêm/xóa thành viên nhóm (Tối đa 3 SV, không trùng nhóm trong đợt)</w:t>
+        <w:t xml:space="preserve">    TN-&gt;&gt;Sys: 5. Thêm/xóa thành viên nhóm (Tối đa 5 SV, không trùng nhóm trong đợt)</w:t>
       </w:r>
       <w:r>
         <w:rPr>
@@ -6963,7 +6911,7 @@
         <w:t>Bước 5 — Thêm/xóa thành viên nhóm</w:t>
       </w:r>
       <w:r>
-        <w:t>: Trưởng nhóm nhập tên đăng nhập của các bạn cùng nhóm. Hệ thống kiểm tra ràng buộc: mỗi nhóm tối đa 3 thành viên và sinh viên chưa tham gia bất kỳ nhóm nào khác trong cùng đợt. Trưởng nhóm có quyền xóa thành viên nếu có thay đổi.</w:t>
+        <w:t>: Trưởng nhóm nhập tên đăng nhập của các bạn cùng nhóm. Hệ thống kiểm tra ràng buộc: cho phép tạo nhóm chưa đủ người, tối đa 5 thành viên và sinh viên chưa tham gia nhóm khác trong cùng đợt. Nhóm phải có 3–5 sinh viên khi đăng ký/duyệt; không được xóa thành viên nếu làm đăng ký đã duyệt còn dưới 3 người.</w:t>
       </w:r>
     </w:p>
     <w:p>
@@ -8165,29 +8113,21 @@
         <w:rPr>
           <w:b/>
         </w:rPr>
-        <w:t>FR-06 (Quy mô nhóm)</w:t>
-      </w:r>
-      <w:r>
-        <w:t xml:space="preserve">: Mỗi nhóm có </w:t>
-      </w:r>
+        <w:t>FR-06 (Quy mô nhóm): Có thể tạo nhóm chưa đủ người; nhóm có tối đa 5 sinh viên và phải có 3–5 sinh viên khi đăng ký/duyệt đề tài. Mỗi nhóm có đúng một trưởng nhóm và mỗi sinh viên chỉ được tham gia tối đa 1 nhóm trong cùng một đợt đăng ký.</w:t>
+      </w:r>
+      <w:r/>
       <w:r>
         <w:rPr>
           <w:b/>
         </w:rPr>
-        <w:t>tối đa 3 sinh viên</w:t>
-      </w:r>
-      <w:r>
-        <w:t xml:space="preserve">. Mỗi sinh viên chỉ được phép tham gia </w:t>
-      </w:r>
+      </w:r>
+      <w:r/>
       <w:r>
         <w:rPr>
           <w:b/>
         </w:rPr>
-        <w:t>tối đa 1 nhóm</w:t>
-      </w:r>
-      <w:r>
-        <w:t xml:space="preserve"> trong cùng một đợt đăng ký.</w:t>
-      </w:r>
+      </w:r>
+      <w:r/>
     </w:p>
     <w:p>
       <w:pPr>
@@ -8921,7 +8861,7 @@
         <w:t>LEADER</w:t>
       </w:r>
       <w:r>
-        <w:t>), danh sách thành viên (tối đa 3 SV), biểu mẫu mời thêm thành viên bằng MSSV và nút xóa thành viên:</w:t>
+        <w:t>), danh sách thành viên (tối đa 5 SV; cần 3–5 SV khi đăng ký), biểu mẫu mời thêm thành viên bằng MSSV và nút xóa thành viên:</w:t>
       </w:r>
     </w:p>
     <w:p>
@@ -9219,7 +9159,7 @@
     </w:p>
     <w:p>
       <w:r>
-        <w:t xml:space="preserve">Toàn bộ 13 ca kiểm thử tích hợp và phân quyền trong bộ test suite </w:t>
+        <w:t>Bộ Member2BusinessRulesTest hiện có 21 ca kiểm thử, gồm các ca nhóm 3–5 người, chặn nhóm thiếu người đăng ký, bảo toàn đăng ký đã duyệt và xóa đề tài nháp. Lần hồi quy toàn hệ thống ngày 07/10/2026 đạt 174/174 test Java và 24/24 test JavaScript; bảng dưới trình bày các ca tiêu biểu:</w:t>
       </w:r>
       <w:r>
         <w:rPr>
@@ -9227,11 +9167,8 @@
           <w:color w:val="C0392B"/>
           <w:sz w:val="20"/>
         </w:rPr>
-        <w:t>Member2BusinessRulesTest</w:t>
-      </w:r>
-      <w:r>
-        <w:t xml:space="preserve"> đã được chạy và vượt qua 100%:</w:t>
-      </w:r>
+      </w:r>
+      <w:r/>
     </w:p>
     <w:tbl>
       <w:tblPr>
@@ -9683,7 +9620,7 @@
                 <w:color w:val="C0392B"/>
                 <w:sz w:val="19"/>
               </w:rPr>
-              <w:t>testStudentGroupRulesMax3AndSingleLeaderAndNoDuplicateGroupInPeriod</w:t>
+              <w:t>testStudentGroupRulesMax5AndSingleLeaderAndNoDuplicateGroupInPeriod</w:t>
             </w:r>
           </w:p>
         </w:tc>
@@ -9707,7 +9644,7 @@
               <w:rPr>
                 <w:sz w:val="19"/>
               </w:rPr>
-              <w:t>Ràng buộc nhóm tối đa 3 SV, tự động gán trưởng nhóm, 1 SV không ở 2 nhóm</w:t>
+              <w:t>Ràng buộc nhóm tối đa 5 SV, đúng một trưởng nhóm, 1 SV không ở 2 nhóm</w:t>
             </w:r>
           </w:p>
         </w:tc>
@@ -10913,7 +10850,7 @@
     </w:p>
     <w:p>
       <w:r>
-        <w:t xml:space="preserve">Cơ sở dữ liệu được thiết kế cho toàn bộ vòng đời đề tài môn học, NCKH, TLCN và KLTN. MySQL 8 là hệ quản trị dữ liệu của môi trường development/production; Flyway quản lý phiên bản schema. Các bảng nghiệp vụ đều kế thừa hai trường audit </w:t>
+        <w:t xml:space="preserve">Cơ sở dữ liệu được thiết kế cho toàn bộ vòng đời đề tài môn học, NCKH, TLCN và KLTN. MySQL 8 là hệ quản trị dữ liệu của môi trường development/production; Hibernate tạo và cập nhật schema trực tiếp từ entity/mapping hiện có. Các bảng nghiệp vụ đều kế thừa hai trường audit </w:t>
       </w:r>
       <w:r>
         <w:rPr>
@@ -10989,7 +10926,7 @@
         <w:pStyle w:val="ListBullet"/>
       </w:pPr>
       <w:r>
-        <w:t>Không sửa migration đã được áp dụng; thay đổi schema luôn tạo migration mới.</w:t>
+        <w:t>Không dùng migration SQL/Flyway trong phiên bản hiện tại; schema được đồng bộ từ entity/mapping JPA hiện có.</w:t>
       </w:r>
     </w:p>
     <w:p>
@@ -13073,126 +13010,8 @@
             <w:vAlign w:val="center"/>
           </w:tcPr>
           <w:p>
-            <w:pPr>
-              <w:spacing w:after="0"/>
-              <w:jc w:val="left"/>
-            </w:pPr>
-            <w:r>
-              <w:rPr>
-                <w:color w:val="C0392B"/>
-                <w:sz w:val="19"/>
-              </w:rPr>
-              <w:t>id</w:t>
-            </w:r>
-            <w:r>
-              <w:rPr>
-                <w:sz w:val="19"/>
-              </w:rPr>
-              <w:t xml:space="preserve"> (PK), </w:t>
-            </w:r>
-            <w:r>
-              <w:rPr>
-                <w:color w:val="C0392B"/>
-                <w:sz w:val="19"/>
-              </w:rPr>
-              <w:t>student_group_id</w:t>
-            </w:r>
-            <w:r>
-              <w:rPr>
-                <w:sz w:val="19"/>
-              </w:rPr>
-              <w:t xml:space="preserve"> (FK), </w:t>
-            </w:r>
-            <w:r>
-              <w:rPr>
-                <w:color w:val="C0392B"/>
-                <w:sz w:val="19"/>
-              </w:rPr>
-              <w:t>topic_id</w:t>
-            </w:r>
-            <w:r>
-              <w:rPr>
-                <w:sz w:val="19"/>
-              </w:rPr>
-              <w:t xml:space="preserve"> (FK), </w:t>
-            </w:r>
-            <w:r>
-              <w:rPr>
-                <w:color w:val="C0392B"/>
-                <w:sz w:val="19"/>
-              </w:rPr>
-              <w:t>registration_period_id</w:t>
-            </w:r>
-            <w:r>
-              <w:rPr>
-                <w:sz w:val="19"/>
-              </w:rPr>
-              <w:t xml:space="preserve"> (FK), </w:t>
-            </w:r>
-            <w:r>
-              <w:rPr>
-                <w:color w:val="C0392B"/>
-                <w:sz w:val="19"/>
-              </w:rPr>
-              <w:t>status</w:t>
-            </w:r>
-            <w:r>
-              <w:rPr>
-                <w:sz w:val="19"/>
-              </w:rPr>
-              <w:t xml:space="preserve">, </w:t>
-            </w:r>
-            <w:r>
-              <w:rPr>
-                <w:color w:val="C0392B"/>
-                <w:sz w:val="19"/>
-              </w:rPr>
-              <w:t>approver_id</w:t>
-            </w:r>
-            <w:r>
-              <w:rPr>
-                <w:sz w:val="19"/>
-              </w:rPr>
-              <w:t xml:space="preserve"> (FK), </w:t>
-            </w:r>
-            <w:r>
-              <w:rPr>
-                <w:color w:val="C0392B"/>
-                <w:sz w:val="19"/>
-              </w:rPr>
-              <w:t>rejection_reason</w:t>
-            </w:r>
-            <w:r>
-              <w:rPr>
-                <w:sz w:val="19"/>
-              </w:rPr>
-              <w:t xml:space="preserve">, </w:t>
-            </w:r>
-            <w:r>
-              <w:rPr>
-                <w:color w:val="C0392B"/>
-                <w:sz w:val="19"/>
-              </w:rPr>
-              <w:t>approved_at</w:t>
-            </w:r>
-            <w:r>
-              <w:rPr>
-                <w:sz w:val="19"/>
-              </w:rPr>
-              <w:t xml:space="preserve">, </w:t>
-            </w:r>
-            <w:r>
-              <w:rPr>
-                <w:color w:val="C0392B"/>
-                <w:sz w:val="19"/>
-              </w:rPr>
-              <w:t>approved_topic_id</w:t>
-            </w:r>
-            <w:r>
-              <w:rPr>
-                <w:sz w:val="19"/>
-              </w:rPr>
-              <w:t xml:space="preserve"> (generated, UK), audit fields</w:t>
+            <w:r>
+              <w:t>id (PK), student_group_id (FK), topic_id (FK), registration_period_id (FK), status, approver_id (FK), rejection_reason, approved_at, audit fields</w:t>
             </w:r>
           </w:p>
         </w:tc>
@@ -13209,28 +13028,8 @@
             <w:vAlign w:val="center"/>
           </w:tcPr>
           <w:p>
-            <w:pPr>
-              <w:spacing w:after="0"/>
-              <w:jc w:val="left"/>
-            </w:pPr>
-            <w:r>
-              <w:rPr>
-                <w:sz w:val="19"/>
-              </w:rPr>
-              <w:t xml:space="preserve">Phiếu đăng ký đề tài. Cột sinh </w:t>
-            </w:r>
-            <w:r>
-              <w:rPr>
-                <w:color w:val="C0392B"/>
-                <w:sz w:val="19"/>
-              </w:rPr>
-              <w:t>approved_topic_id</w:t>
-            </w:r>
-            <w:r>
-              <w:rPr>
-                <w:sz w:val="19"/>
-              </w:rPr>
-              <w:t xml:space="preserve"> bảo đảm một đề tài chỉ có một nhóm được duyệt.</w:t>
+            <w:r>
+              <w:t>Phiếu đăng ký đề tài. Service khóa bi quan khi duyệt để bảo đảm một đề tài chỉ có một nhóm APPROVED.</w:t>
             </w:r>
           </w:p>
         </w:tc>
@@ -15480,22 +15279,17 @@
           <w:color w:val="C0392B"/>
           <w:sz w:val="20"/>
         </w:rPr>
-        <w:t>uk_topic_registration_approved_topic</w:t>
-      </w:r>
-      <w:r>
-        <w:t xml:space="preserve">: mỗi đề tài chỉ có một đăng ký </w:t>
-      </w:r>
+        <w:t>Duyệt đăng ký khóa bi quan bản ghi đăng ký và đề tài; service chỉ cho một đăng ký APPROVED trên mỗi đề tài.</w:t>
+      </w:r>
+      <w:r/>
       <w:r>
         <w:rPr>
           <w:rFonts w:ascii="Consolas" w:hAnsi="Consolas"/>
           <w:color w:val="C0392B"/>
           <w:sz w:val="20"/>
         </w:rPr>
-        <w:t>APPROVED</w:t>
-      </w:r>
-      <w:r>
-        <w:t>.</w:t>
-      </w:r>
+      </w:r>
+      <w:r/>
     </w:p>
     <w:p>
       <w:pPr>
@@ -15587,7 +15381,7 @@
     </w:p>
     <w:p>
       <w:r>
-        <w:t>Các luật có tính tổng hợp như tối đa hai GVHD, nhóm tối đa ba sinh viên, hội đồng 3–5 giảng viên, đúng một chủ tịch/thư ký và cấm chấm đề tài đang hướng dẫn được kiểm tra tại service trong transaction.</w:t>
+        <w:t>Các luật có tính tổng hợp như tối đa hai GVHD, nhóm tối đa năm sinh viên và phải đủ 3–5 người khi đăng ký, hội đồng 3–5 giảng viên, đúng một chủ tịch/thư ký và cấm chấm đề tài đang hướng dẫn được kiểm tra tại service trong transaction. Duyệt đăng ký và thay đổi thành viên dùng khóa bi quan để chống thao tác đồng thời; không thay đổi entity/mapping hay làm lại cơ sở dữ liệu.</w:t>
       </w:r>
     </w:p>
     <w:p>
@@ -15599,7 +15393,7 @@
         <w:rPr>
           <w:rFonts w:ascii="Times New Roman" w:eastAsia="Times New Roman" w:hAnsi="Times New Roman"/>
         </w:rPr>
-        <w:t>4.5 Quản lý phiên bản schema</w:t>
+        <w:t>4.5 Quản lý schema bằng JPA/Hibernate</w:t>
       </w:r>
       <w:bookmarkEnd w:id="43"/>
     </w:p>
@@ -15633,17 +15427,8 @@
             <w:vAlign w:val="center"/>
           </w:tcPr>
           <w:p>
-            <w:pPr>
-              <w:spacing w:after="0"/>
-              <w:jc w:val="center"/>
-            </w:pPr>
-            <w:r>
-              <w:rPr>
-                <w:b/>
-                <w:color w:val="FFFFFF"/>
-                <w:sz w:val="19"/>
-              </w:rPr>
-              <w:t>Migration</w:t>
+            <w:r>
+              <w:t>Thành phần</w:t>
             </w:r>
           </w:p>
         </w:tc>
@@ -15692,15 +15477,8 @@
             <w:vAlign w:val="center"/>
           </w:tcPr>
           <w:p>
-            <w:pPr>
-              <w:spacing w:after="0"/>
-              <w:jc w:val="left"/>
-            </w:pPr>
-            <w:r>
-              <w:rPr>
-                <w:sz w:val="19"/>
-              </w:rPr>
-              <w:t>V1</w:t>
+            <w:r>
+              <w:t>Entity</w:t>
             </w:r>
           </w:p>
         </w:tc>
@@ -15716,15 +15494,8 @@
             <w:vAlign w:val="center"/>
           </w:tcPr>
           <w:p>
-            <w:pPr>
-              <w:spacing w:after="0"/>
-              <w:jc w:val="left"/>
-            </w:pPr>
-            <w:r>
-              <w:rPr>
-                <w:sz w:val="19"/>
-              </w:rPr>
-              <w:t>Tài khoản, quyền và bảng nối.</w:t>
+            <w:r>
+              <w:t>Khai báo bảng, cột, quan hệ và ràng buộc bằng annotation JPA.</w:t>
             </w:r>
           </w:p>
         </w:tc>
@@ -15747,15 +15518,8 @@
             <w:vAlign w:val="center"/>
           </w:tcPr>
           <w:p>
-            <w:pPr>
-              <w:spacing w:after="0"/>
-              <w:jc w:val="left"/>
-            </w:pPr>
-            <w:r>
-              <w:rPr>
-                <w:sz w:val="19"/>
-              </w:rPr>
-              <w:t>V2</w:t>
+            <w:r>
+              <w:t>Repository</w:t>
             </w:r>
           </w:p>
         </w:tc>
@@ -15772,15 +15536,8 @@
             <w:vAlign w:val="center"/>
           </w:tcPr>
           <w:p>
-            <w:pPr>
-              <w:spacing w:after="0"/>
-              <w:jc w:val="left"/>
-            </w:pPr>
-            <w:r>
-              <w:rPr>
-                <w:sz w:val="19"/>
-              </w:rPr>
-              <w:t>Bộ môn và liên kết người dùng–bộ môn.</w:t>
+            <w:r>
+              <w:t>Dùng Spring Data JPA và derived query; không dùng SQL/JPQL thủ công.</w:t>
             </w:r>
           </w:p>
         </w:tc>
@@ -15802,15 +15559,8 @@
             <w:vAlign w:val="center"/>
           </w:tcPr>
           <w:p>
-            <w:pPr>
-              <w:spacing w:after="0"/>
-              <w:jc w:val="left"/>
-            </w:pPr>
-            <w:r>
-              <w:rPr>
-                <w:sz w:val="19"/>
-              </w:rPr>
-              <w:t>V3</w:t>
+            <w:r>
+              <w:t>Development</w:t>
             </w:r>
           </w:p>
         </w:tc>
@@ -15826,15 +15576,8 @@
             <w:vAlign w:val="center"/>
           </w:tcPr>
           <w:p>
-            <w:pPr>
-              <w:spacing w:after="0"/>
-              <w:jc w:val="left"/>
-            </w:pPr>
-            <w:r>
-              <w:rPr>
-                <w:sz w:val="19"/>
-              </w:rPr>
-              <w:t>Đợt đăng ký.</w:t>
+            <w:r>
+              <w:t>Hibernate ddl-auto=update tạo/cập nhật schema rỗng từ entity hiện có.</w:t>
             </w:r>
           </w:p>
         </w:tc>
@@ -15857,15 +15600,8 @@
             <w:vAlign w:val="center"/>
           </w:tcPr>
           <w:p>
-            <w:pPr>
-              <w:spacing w:after="0"/>
-              <w:jc w:val="left"/>
-            </w:pPr>
-            <w:r>
-              <w:rPr>
-                <w:sz w:val="19"/>
-              </w:rPr>
-              <w:t>V4–V5</w:t>
+            <w:r>
+              <w:t>Test</w:t>
             </w:r>
           </w:p>
         </w:tc>
@@ -15882,15 +15618,8 @@
             <w:vAlign w:val="center"/>
           </w:tcPr>
           <w:p>
-            <w:pPr>
-              <w:spacing w:after="0"/>
-              <w:jc w:val="left"/>
-            </w:pPr>
-            <w:r>
-              <w:rPr>
-                <w:sz w:val="19"/>
-              </w:rPr>
-              <w:t>Dữ liệu tham chiếu và đổi tên bộ môn An toàn thông tin.</w:t>
+            <w:r>
+              <w:t>H2 tạo schema trực tiếp từ entity cho kiểm thử tự động.</w:t>
             </w:r>
           </w:p>
         </w:tc>
@@ -15912,15 +15641,8 @@
             <w:vAlign w:val="center"/>
           </w:tcPr>
           <w:p>
-            <w:pPr>
-              <w:spacing w:after="0"/>
-              <w:jc w:val="left"/>
-            </w:pPr>
-            <w:r>
-              <w:rPr>
-                <w:sz w:val="19"/>
-              </w:rPr>
-              <w:t>V6</w:t>
+            <w:r>
+              <w:t>Production</w:t>
             </w:r>
           </w:p>
         </w:tc>
@@ -15936,235 +15658,8 @@
             <w:vAlign w:val="center"/>
           </w:tcPr>
           <w:p>
-            <w:pPr>
-              <w:spacing w:after="0"/>
-              <w:jc w:val="left"/>
-            </w:pPr>
-            <w:r>
-              <w:rPr>
-                <w:sz w:val="19"/>
-              </w:rPr>
-              <w:t>Đề tài, GVHD, nhóm, đăng ký và báo cáo.</w:t>
-            </w:r>
-          </w:p>
-        </w:tc>
-      </w:tr>
-      <w:tr>
-        <w:trPr>
-          <w:cantSplit/>
-          <w:jc w:val="center"/>
-        </w:trPr>
-        <w:tc>
-          <w:tcPr>
-            <w:tcW w:w="4759" w:type="dxa"/>
-            <w:shd w:val="clear" w:color="auto" w:fill="EAF2F8"/>
-            <w:tcMar>
-              <w:top w:w="80" w:type="dxa"/>
-              <w:left w:w="90" w:type="dxa"/>
-              <w:bottom w:w="80" w:type="dxa"/>
-              <w:right w:w="90" w:type="dxa"/>
-            </w:tcMar>
-            <w:vAlign w:val="center"/>
-          </w:tcPr>
-          <w:p>
-            <w:pPr>
-              <w:spacing w:after="0"/>
-              <w:jc w:val="left"/>
-            </w:pPr>
-            <w:r>
-              <w:rPr>
-                <w:sz w:val="19"/>
-              </w:rPr>
-              <w:t>V7</w:t>
-            </w:r>
-          </w:p>
-        </w:tc>
-        <w:tc>
-          <w:tcPr>
-            <w:tcW w:w="4759" w:type="dxa"/>
-            <w:shd w:val="clear" w:color="auto" w:fill="EAF2F8"/>
-            <w:tcMar>
-              <w:top w:w="80" w:type="dxa"/>
-              <w:left w:w="90" w:type="dxa"/>
-              <w:bottom w:w="80" w:type="dxa"/>
-              <w:right w:w="90" w:type="dxa"/>
-            </w:tcMar>
-            <w:vAlign w:val="center"/>
-          </w:tcPr>
-          <w:p>
-            <w:pPr>
-              <w:spacing w:after="0"/>
-              <w:jc w:val="left"/>
-            </w:pPr>
-            <w:r>
-              <w:rPr>
-                <w:sz w:val="19"/>
-              </w:rPr>
-              <w:t>Phản biện, hội đồng, tiêu chí, đánh giá, kết quả và thông báo.</w:t>
-            </w:r>
-          </w:p>
-        </w:tc>
-      </w:tr>
-      <w:tr>
-        <w:trPr>
-          <w:cantSplit/>
-          <w:jc w:val="center"/>
-        </w:trPr>
-        <w:tc>
-          <w:tcPr>
-            <w:tcW w:w="4759" w:type="dxa"/>
-            <w:tcMar>
-              <w:top w:w="80" w:type="dxa"/>
-              <w:left w:w="90" w:type="dxa"/>
-              <w:bottom w:w="80" w:type="dxa"/>
-              <w:right w:w="90" w:type="dxa"/>
-            </w:tcMar>
-            <w:vAlign w:val="center"/>
-          </w:tcPr>
-          <w:p>
-            <w:pPr>
-              <w:spacing w:after="0"/>
-              <w:jc w:val="left"/>
-            </w:pPr>
-            <w:r>
-              <w:rPr>
-                <w:sz w:val="19"/>
-              </w:rPr>
-              <w:t>V8</w:t>
-            </w:r>
-          </w:p>
-        </w:tc>
-        <w:tc>
-          <w:tcPr>
-            <w:tcW w:w="4759" w:type="dxa"/>
-            <w:tcMar>
-              <w:top w:w="80" w:type="dxa"/>
-              <w:left w:w="90" w:type="dxa"/>
-              <w:bottom w:w="80" w:type="dxa"/>
-              <w:right w:w="90" w:type="dxa"/>
-            </w:tcMar>
-            <w:vAlign w:val="center"/>
-          </w:tcPr>
-          <w:p>
-            <w:pPr>
-              <w:spacing w:after="0"/>
-              <w:jc w:val="left"/>
-            </w:pPr>
-            <w:r>
-              <w:rPr>
-                <w:sz w:val="19"/>
-              </w:rPr>
-              <w:t>Năm tiêu chí mẫu cho các đợt hiện có.</w:t>
-            </w:r>
-          </w:p>
-        </w:tc>
-      </w:tr>
-      <w:tr>
-        <w:trPr>
-          <w:cantSplit/>
-          <w:jc w:val="center"/>
-        </w:trPr>
-        <w:tc>
-          <w:tcPr>
-            <w:tcW w:w="4759" w:type="dxa"/>
-            <w:shd w:val="clear" w:color="auto" w:fill="EAF2F8"/>
-            <w:tcMar>
-              <w:top w:w="80" w:type="dxa"/>
-              <w:left w:w="90" w:type="dxa"/>
-              <w:bottom w:w="80" w:type="dxa"/>
-              <w:right w:w="90" w:type="dxa"/>
-            </w:tcMar>
-            <w:vAlign w:val="center"/>
-          </w:tcPr>
-          <w:p>
-            <w:pPr>
-              <w:spacing w:after="0"/>
-              <w:jc w:val="left"/>
-            </w:pPr>
-            <w:r>
-              <w:rPr>
-                <w:sz w:val="19"/>
-              </w:rPr>
-              <w:t>V9</w:t>
-            </w:r>
-          </w:p>
-        </w:tc>
-        <w:tc>
-          <w:tcPr>
-            <w:tcW w:w="4759" w:type="dxa"/>
-            <w:shd w:val="clear" w:color="auto" w:fill="EAF2F8"/>
-            <w:tcMar>
-              <w:top w:w="80" w:type="dxa"/>
-              <w:left w:w="90" w:type="dxa"/>
-              <w:bottom w:w="80" w:type="dxa"/>
-              <w:right w:w="90" w:type="dxa"/>
-            </w:tcMar>
-            <w:vAlign w:val="center"/>
-          </w:tcPr>
-          <w:p>
-            <w:pPr>
-              <w:spacing w:after="0"/>
-              <w:jc w:val="left"/>
-            </w:pPr>
-            <w:r>
-              <w:rPr>
-                <w:sz w:val="19"/>
-              </w:rPr>
-              <w:t>Unique đăng ký được duyệt và bảo đảm tiêu chí theo đợt.</w:t>
-            </w:r>
-          </w:p>
-        </w:tc>
-      </w:tr>
-      <w:tr>
-        <w:trPr>
-          <w:cantSplit/>
-          <w:jc w:val="center"/>
-        </w:trPr>
-        <w:tc>
-          <w:tcPr>
-            <w:tcW w:w="4759" w:type="dxa"/>
-            <w:tcMar>
-              <w:top w:w="80" w:type="dxa"/>
-              <w:left w:w="90" w:type="dxa"/>
-              <w:bottom w:w="80" w:type="dxa"/>
-              <w:right w:w="90" w:type="dxa"/>
-            </w:tcMar>
-            <w:vAlign w:val="center"/>
-          </w:tcPr>
-          <w:p>
-            <w:pPr>
-              <w:spacing w:after="0"/>
-              <w:jc w:val="left"/>
-            </w:pPr>
-            <w:r>
-              <w:rPr>
-                <w:sz w:val="19"/>
-              </w:rPr>
-              <w:t>V10</w:t>
-            </w:r>
-          </w:p>
-        </w:tc>
-        <w:tc>
-          <w:tcPr>
-            <w:tcW w:w="4759" w:type="dxa"/>
-            <w:tcMar>
-              <w:top w:w="80" w:type="dxa"/>
-              <w:left w:w="90" w:type="dxa"/>
-              <w:bottom w:w="80" w:type="dxa"/>
-              <w:right w:w="90" w:type="dxa"/>
-            </w:tcMar>
-            <w:vAlign w:val="center"/>
-          </w:tcPr>
-          <w:p>
-            <w:pPr>
-              <w:spacing w:after="0"/>
-              <w:jc w:val="left"/>
-            </w:pPr>
-            <w:r>
-              <w:rPr>
-                <w:sz w:val="19"/>
-              </w:rPr>
-              <w:t>Chuyển việc sinh tiêu chí mặc định từ trigger sang service và backfill dữ liệu.</w:t>
+            <w:r>
+              <w:t>Sao lưu và kiểm thử MySQL trước khi triển khai; phiên bản này không có migration SQL/Flyway.</w:t>
             </w:r>
           </w:p>
         </w:tc>
@@ -16173,7 +15668,7 @@
     <w:p/>
     <w:p>
       <w:r>
-        <w:t xml:space="preserve">Trong production, Hibernate dùng </w:t>
+        <w:t>Trong production, cấu hình JPA/Hibernate sử dụng entity relationship mapping hiện có; thay đổi nghiệp vụ 3–5 thành viên không yêu cầu thay đổi schema.</w:t>
       </w:r>
       <w:r>
         <w:rPr>
@@ -16181,11 +15676,8 @@
           <w:color w:val="C0392B"/>
           <w:sz w:val="20"/>
         </w:rPr>
-        <w:t>ddl-auto=validate</w:t>
-      </w:r>
-      <w:r>
-        <w:t>; Flyway là thành phần duy nhất tạo hoặc thay đổi schema.</w:t>
-      </w:r>
+      </w:r>
+      <w:r/>
     </w:p>
     <w:p>
       <w:r>
@@ -17193,7 +16685,7 @@
     </w:p>
     <w:p>
       <w:r>
-        <w:t>Hệ thống đã hoàn thiện luồng nghiệp vụ từ quản trị tài khoản, tạo đợt, đề xuất và duyệt đề tài, lập nhóm, đăng ký, nộp báo cáo đến phản biện, hội đồng, chấm điểm, khóa điểm, xác nhận và công bố. Phiên E2E trên MySQL đi đủ 16 bước; điểm tổng kết thực tế là 8,79. Bộ kiểm thử tự động đạt 44/44 test. Health check, Flyway V1–V10, phân quyền, static resource và upload local đều được xác minh.</w:t>
+        <w:t>Hệ thống đã hoàn thiện luồng nghiệp vụ từ quản trị tài khoản, tạo đợt, đề xuất và duyệt đề tài, lập nhóm, đăng ký, nộp báo cáo đến phản biện, hội đồng, chấm điểm, khóa điểm, xác nhận và công bố. Phiên E2E trên MySQL đi đủ 16 bước; điểm tổng kết thực tế là 8,79. Lần hồi quy gần nhất ngày 07/10/2026 đạt 174/174 test Java và 24/24 test JavaScript. Health check, phân quyền, static resource và upload local đều được xác minh; hosting production vẫn cần URL chạy thật.</w:t>
       </w:r>
     </w:p>
     <w:p>
@@ -17262,7 +16754,7 @@
         <w:pStyle w:val="ListBullet"/>
       </w:pPr>
       <w:r>
-        <w:t>Flyway quản lý schema; upload tách khỏi static; form Thymeleaf giữ CSRF.</w:t>
+        <w:t>JPA/Hibernate đồng bộ schema từ entity; upload tách khỏi static; form Thymeleaf giữ CSRF.</w:t>
       </w:r>
     </w:p>
     <w:p>
@@ -17403,7 +16895,7 @@
     </w:p>
     <w:p>
       <w:r>
-        <w:t>Ngày 24/09/2026, hệ thống được kiểm thử đủ 16 bước trên MySQL 8.0.46 bằng Maven tại cổng 8090. Kết quả cuối: 44/44 test tự động đạt; 4 phiếu chấm bị khóa; điểm tổng kết 8,79; Chủ tịch xác nhận; Khoa công bố; sinh viên trong nhóm xem được và sinh viên ngoài nhóm nhận 403.</w:t>
+        <w:t>Ngày 24/09/2026, hệ thống được kiểm thử đủ 16 bước trên MySQL 8.0.46 bằng Maven tại cổng 8090. Phiên E2E khi đó đạt 44/44 test; lần hồi quy ngày 07/10/2026 đạt 174/174 test Java và 24/24 test JavaScript. Bốn phiếu chấm bị khóa, điểm tổng kết 8,79, Chủ tịch xác nhận, Khoa công bố; sinh viên trong nhóm xem được và sinh viên ngoài nhóm nhận 403.</w:t>
       </w:r>
     </w:p>
     <w:tbl>
@@ -17550,15 +17042,8 @@
             <w:vAlign w:val="center"/>
           </w:tcPr>
           <w:p>
-            <w:pPr>
-              <w:spacing w:after="0"/>
-              <w:jc w:val="left"/>
-            </w:pPr>
-            <w:r>
-              <w:rPr>
-                <w:sz w:val="19"/>
-              </w:rPr>
-              <w:t>MySQL / Flyway</w:t>
+            <w:r>
+              <w:t>MySQL / JPA</w:t>
             </w:r>
           </w:p>
         </w:tc>
@@ -17575,15 +17060,8 @@
             <w:vAlign w:val="center"/>
           </w:tcPr>
           <w:p>
-            <w:pPr>
-              <w:spacing w:after="0"/>
-              <w:jc w:val="left"/>
-            </w:pPr>
-            <w:r>
-              <w:rPr>
-                <w:sz w:val="19"/>
-              </w:rPr>
-              <w:t>MySQL 8.0.46; schema version 10</w:t>
+            <w:r>
+              <w:t>MySQL 8.0.46; schema ánh xạ từ entity</w:t>
             </w:r>
           </w:p>
         </w:tc>

</xml_diff>